<commit_message>
docs: align employee public view with live Neon DB (4 actual employees, real usernames, phones and is_active)
</commit_message>
<xml_diff>
--- a/docs/KichBan_LoiNoi_ThuyetTrinh_BaoVe.docx
+++ b/docs/KichBan_LoiNoi_ThuyetTrinh_BaoVe.docx
@@ -903,7 +903,7 @@
                 <w:color w:val="0F172A"/>
                 <w:sz w:val="23"/>
               </w:rPr>
-              <w:t>"Để đối chứng, nhóm chuyển sang vai trò Quản lý phòng máy bằng SET ROLE nv_manager. Do có đặc quyền BYPASSRLS, ở câu truy vấn thứ hai Quản lý nhìn thấy đầy đủ toàn bộ 9 hóa đơn của cả nhân viên Thảo (6 hóa đơn) lẫn nhân viên Nam (3 hóa đơn). Ở câu truy vấn thứ ba, Quản lý xem được báo cáo tổng hợp doanh thu theo từng nhân viên ca trực: ca của Thảo lập 6 hóa đơn đạt 838 nghìn đồng, ca của Nam lập 3 hóa đơn đạt 72 nghìn đồng."</w:t>
+              <w:t>"Để đối chứng, nhóm chuyển sang vai trò Quản lý phòng máy bằng SET ROLE nv_manager. Do có đặc quyền BYPASSRLS, ở câu truy vấn thứ hai Quản lý nhìn thấy đầy đủ toàn bộ 9 hóa đơn của cả nhân viên Thảo (6 hóa đơn) lẫn nhân viên Nam (3 hóa đơn). Ở câu truy vấn thứ ba, Quản lý xem được báo cáo tổng hợp doanh thu theo từng nhân viên ca trực: ca của Thảo lập 6 hóa đơn đạt 840 nghìn đồng, ca của Nam lập 3 hóa đơn đạt 72 nghìn đồng."</w:t>
             </w:r>
           </w:p>
         </w:tc>
@@ -1013,7 +1013,7 @@
               <w:t>"Tiếp theo, thu ngân Thảo chuyển lại vai trò và cố tình truy cập vào cột salary để xem trộm tiền lương của đồng nghiệp. CSDL lập tức kích hoạt cơ chế CLS và trả về lỗi từ chối truy cập ERROR: permission denied for table employee.</w:t>
               <w:br/>
               <w:br/>
-              <w:t>Để nhân viên vẫn làm việc phối hợp được mà không lộ thông tin nhạy cảm, hệ thống cấp quyền cho Thảo tra cứu qua View an toàn hr.vw_employee_public. Qua View này, Thảo xem được đầy đủ họ tên, số điện thoại và ca trực của 5 nhân viên để tiện giao ca, nhưng cột tiền lương đã được che giấu an toàn tuyệt đối."</w:t>
+              <w:t>Để nhân viên vẫn làm việc phối hợp được mà không lộ thông tin nhạy cảm, hệ thống cấp quyền cho Thảo tra cứu qua View an toàn hr.vw_employee_public. Qua View này, Thảo xem được đầy đủ họ tên, số điện thoại, tài khoản, ca trực và trạng thái đang hoạt động (is_active = t) của 4 nhân viên thực tế để tiện giao ca, nhưng cột tiền lương đã được che giấu an toàn tuyệt đối."</w:t>
             </w:r>
           </w:p>
         </w:tc>

</xml_diff>

<commit_message>
perf: redesign step 3.2 on 25k invoice history table where index scan is 40x faster than seq scan
</commit_message>
<xml_diff>
--- a/docs/KichBan_LoiNoi_ThuyetTrinh_BaoVe.docx
+++ b/docs/KichBan_LoiNoi_ThuyetTrinh_BaoVe.docx
@@ -1322,7 +1322,7 @@
           <w:color w:val="0F4C81"/>
           <w:sz w:val="25"/>
         </w:rPr>
-        <w:t>Bước 3.2: Thao tác thủ công đối chiếu EXPLAIN ANALYZE trên bảng hóa đơn</w:t>
+        <w:t>Bước 3.2: Thao tác thủ công đối chiếu EXPLAIN ANALYZE trên bảng lịch sử 25.000 dòng</w:t>
       </w:r>
     </w:p>
     <w:tbl>
@@ -1358,7 +1358,7 @@
                 <w:color w:val="B45309"/>
                 <w:sz w:val="21"/>
               </w:rPr>
-              <w:t>👉 THAO TÁC TRÊN MÁY: Neon SQL bên trái: DROP index, chạy EXPLAIN Seq Scan, sau đó CREATE INDEX và chạy lại EXPLAIN Index Scan.</w:t>
+              <w:t>👉 THAO TÁC TRÊN MÁY: Neon SQL bên trái: DROP index, chạy EXPLAIN Seq Scan trên invoice_history, sau đó CREATE INDEX và chạy lại EXPLAIN.</w:t>
             </w:r>
           </w:p>
         </w:tc>
@@ -1406,7 +1406,7 @@
                 <w:color w:val="0F172A"/>
                 <w:sz w:val="23"/>
               </w:rPr>
-              <w:t>"Nhóm tiếp tục đối chiếu trên bảng billing.invoice thực tế: khi chưa có chỉ mục, câu truy vấn tìm hóa đơn 630.000 VNĐ dùng Seq Scan on invoice. Sau khi tạo B-Tree Index trên cột total_amount và ép dùng chỉ mục, kế hoạch thực thi chuyển ngay sang Index Scan using idx_invoice_total_amount chính xác và tối ưu."</w:t>
+              <w:t>"Nhóm tiếp tục đối chiếu thực tế trên bảng lịch sử giao dịch 25.000 dòng billing.invoice_history: Khi chưa có chỉ mục, CSDL phải Seq Scan duyệt qua toàn bộ 25.000 bản ghi, đọc 179 block bộ nhớ và mất gần 2 mili-giây. Ngay sau khi tạo B-Tree Index trên cột số tiền, CSDL tự động kích hoạt Index Scan, chỉ đọc đúng 2 block bộ nhớ và thời gian thực thi giảm xuống chỉ còn 0.04 mili-giây, tốc độ nhanh vượt trội hơn 40 lần!"</w:t>
             </w:r>
           </w:p>
         </w:tc>

</xml_diff>

<commit_message>
docs: remove limit 10 from staging query to view all raw dirty customer records
</commit_message>
<xml_diff>
--- a/docs/KichBan_LoiNoi_ThuyetTrinh_BaoVe.docx
+++ b/docs/KichBan_LoiNoi_ThuyetTrinh_BaoVe.docx
@@ -500,11 +500,11 @@
               <w:br/>
               <w:t>Kính mời Thầy Cô quan sát cửa sổ Neon SQL bên trái:</w:t>
               <w:br/>
-              <w:t>+ Đầu tiên, ở bảng dữ liệu thô Staging, Thầy Cô thấy rõ 10 dòng đầu chứa đầy đủ các lỗi nhập liệu thực tế.</w:t>
+              <w:t>+ Đầu tiên, ở bảng dữ liệu thô Staging, Thầy Cô thấy rõ toàn bộ các dòng chứa đầy đủ các lỗi nhập liệu thực tế.</w:t>
               <w:br/>
               <w:t>+ Thứ hai, ở bảng cách ly dữ liệu lỗi rejected_rows, hệ thống đã phát hiện và chặn đứng đúng 4 bản ghi rủi ro: gồm 2 bản ghi tiền âm (-50k và -100k) và 2 bản ghi sai độ dài số điện thoại, kèm nguyên nhân chi tiết.</w:t>
               <w:br/>
-              <w:t>+ Thứ ba, ở bảng khách hàng chính core.customer, 16 bản ghi hợp lệ đã được chuẩn hóa họ tên chuẩn mực, định dạng số điện thoại, tự động tạo tài khoản, sinh email hợp lệ và số dư dương đạt chuẩn 3NF."</w:t>
+              <w:t>+ Thứ ba, ở bảng khách hàng chính core.customer, toàn bộ các khách hàng sạch đã được chuẩn hóa họ tên chuẩn mực, định dạng số điện thoại, tự động tạo tài khoản, sinh email hợp lệ và số dư dương đạt chuẩn 3NF."</w:t>
             </w:r>
           </w:p>
         </w:tc>

</xml_diff>